<commit_message>
fix: apply audit fixes for milestone plan, MLflow BERTScore logging, and stray file
- Correct milestone plan document and add scripts/fix_milestone_plan.py
- Track BERTScore alongside other MLflow metrics
- Remove stray empty 'literal' file and adjust deploy script
</commit_message>
<xml_diff>
--- a/docs/Milestone_Execution_Plan.docx
+++ b/docs/Milestone_Execution_Plan.docx
@@ -3471,7 +3471,11 @@
                 <w:sz w:val="17"/>
                 <w:szCs w:val="17"/>
               </w:rPr>
-              <w:t xml:space="preserve">Description</w:t>
+              <w:t>Description</w:t>
+              <w:br/>
+              <w:t>Load qiaojin/PubMedQA pqa_artificial subset (~211,000 rows) from HuggingFace using the datasets library. Confirm all three columns exist (instruction, input, output) with no schema drift. Log raw row count, null counts per column, and a 5-row sample. Save as data/raw/pubmedqa_raw.csv and write schema_validation_report.md.</w:t>
+              <w:br/>
+              <w:t>Load qiaojin/PubMedQA pqa_artificial subset (211,269 rows) from HuggingFace using the datasets library. Confirm all three columns exist (instruction, input, output) with no schema drift. Log raw row count, null counts per column, and a 5-row sample. Save as data/raw/pubmedqa_raw.csv and write schema_validation_report.md.</w:t>
             </w:r>
           </w:p>
           <w:p>
@@ -3516,7 +3520,9 @@
                 <w:sz w:val="17"/>
                 <w:szCs w:val="17"/>
               </w:rPr>
-              <w:t xml:space="preserve">Deliverable</w:t>
+              <w:t>Deliverable</w:t>
+              <w:br/>
+              <w:t>pubmedqa_raw.csv (211,269 rows) + schema_validation_report.md</w:t>
             </w:r>
           </w:p>
           <w:p>
@@ -5599,7 +5605,11 @@
                 <w:sz w:val="17"/>
                 <w:szCs w:val="17"/>
               </w:rPr>
-              <w:t xml:space="preserve">Description</w:t>
+              <w:t>Description</w:t>
+              <w:br/>
+              <w:t>Load pubmedqa_labelled.csv, chunk each Q&amp;A pair into a single text block, generate embeddings with pritamdeka/S-PubMedBert-MS-MARCO. Store 209,108 embeddings in a FAISS IndexFlatIP index. Save to data/embeddings/faiss_index/. Verify by querying 5 test questions and inspecting top-3 retrieved chunks. Build FAISS index (data/embeddings/faiss_index/pubmedqa_index_flatip.faiss).</w:t>
+              <w:br/>
+              <w:t>Load pubmedqa_labelled.csv, chunk each Q&amp;A pair into a single text block, generate embeddings with pritamdeka/S-PubMedBert-MS-MARCO. Store 209,108 chunk embeddings in a FAISS IndexFlatL2 index. Save to data/embeddings/faiss_index/. Verify by querying 5 test questions and inspecting top-3 retrieved chunks. Build notebooks/04_embeddings_vectorstore.ipynb.</w:t>
             </w:r>
           </w:p>
           <w:p>
@@ -5644,7 +5654,9 @@
                 <w:sz w:val="17"/>
                 <w:szCs w:val="17"/>
               </w:rPr>
-              <w:t xml:space="preserve">Deliverable</w:t>
+              <w:t>Deliverable</w:t>
+              <w:br/>
+              <w:t>04_embeddings_vectorstore.ipynb + saved FAISS index (209,108 vectors)</w:t>
             </w:r>
           </w:p>
           <w:p>
@@ -6046,7 +6058,7 @@
                 <w:sz w:val="19"/>
                 <w:szCs w:val="19"/>
               </w:rPr>
-              <w:t xml:space="preserve">DistilBERT Classification Model</w:t>
+              <w:t>BioBERT Classification Model</w:t>
             </w:r>
           </w:p>
         </w:tc>
@@ -6191,7 +6203,11 @@
                 <w:sz w:val="17"/>
                 <w:szCs w:val="17"/>
               </w:rPr>
-              <w:t xml:space="preserve">Description</w:t>
+              <w:t>Description</w:t>
+              <w:br/>
+              <w:t>Fine-tune dmis-lab/biobert-v1.1 on pubmedqa_labelled.csv (80/10/10 split). Use HuggingFace Trainer: lr=2e-5, batch=16, epochs=3. Evaluate with sklearn classification_report — record per-class F1, macro F1, accuracy. Target macro F1 ≥ 78%. Save fine-tuned model to models/classifier/. Build notebooks/06_classification_model.ipynb.</w:t>
+              <w:br/>
+              <w:t>Fine-tune dmis-lab/biobert-v1.1 on pubmedqa_labelled.csv (80/10/10 split). Use HuggingFace Trainer: lr=2e-5, batch=16, epochs=3. Evaluate with sklearn classification_report — record per-class F1, macro F1, accuracy. Target macro F1 ≥ 78%. Save fine-tuned model to models/classifier/. Build notebooks/06_classification_model.ipynb.</w:t>
             </w:r>
           </w:p>
           <w:p>

</xml_diff>